<commit_message>
Add the valuation log, checks, and client documents without the sample archive.
Co-authored-by: Cursor <cursoragent@cursor.com>
</commit_message>
<xml_diff>
--- a/new-app/docs/Application-Progress-Report.docx
+++ b/new-app/docs/Application-Progress-Report.docx
@@ -42,7 +42,7 @@
         <w:t xml:space="preserve"> </w:t>
       </w:r>
       <w:r>
-        <w:t xml:space="preserve">1 October 2026</w:t>
+        <w:t xml:space="preserve">5 October 2026</w:t>
       </w:r>
       <w:r>
         <w:br/>
@@ -74,7 +74,7 @@
         <w:t xml:space="preserve"> </w:t>
       </w:r>
       <w:r>
-        <w:t xml:space="preserve">the requirements document (manual assembly and 401(k) review)</w:t>
+        <w:t xml:space="preserve">the requirements document (manual assembly and 401(k) review), including the updated instructions and the assembly-log column sheet</w:t>
       </w:r>
     </w:p>
     <w:p>
@@ -138,7 +138,7 @@
                 <w:b/>
                 <w:bCs/>
               </w:rPr>
-              <w:t xml:space="preserve">83%</w:t>
+              <w:t xml:space="preserve">88%</w:t>
             </w:r>
           </w:p>
         </w:tc>
@@ -186,7 +186,7 @@
               <w:pStyle w:val="Compact"/>
             </w:pPr>
             <w:r>
-              <w:t xml:space="preserve">18</w:t>
+              <w:t xml:space="preserve">20</w:t>
             </w:r>
           </w:p>
         </w:tc>
@@ -210,7 +210,7 @@
               <w:pStyle w:val="Compact"/>
             </w:pPr>
             <w:r>
-              <w:t xml:space="preserve">4</w:t>
+              <w:t xml:space="preserve">2</w:t>
             </w:r>
           </w:p>
         </w:tc>
@@ -263,13 +263,34 @@
         <w:br/>
       </w:r>
       <w:r>
-        <w:t xml:space="preserve">(18 × 100) + (4 × 50) + (2 × 0) = 2,000.</w:t>
+        <w:t xml:space="preserve">(20 × 100) + (2 × 50) + (2 × 0) = 2,100.</w:t>
       </w:r>
       <w:r>
         <w:br/>
       </w:r>
       <w:r>
-        <w:t xml:space="preserve">2,000 ÷ 24 =</w:t>
+        <w:t xml:space="preserve">2,100 ÷ 24 = 87.5%, reported as</w:t>
+      </w:r>
+      <w:r>
+        <w:t xml:space="preserve"> </w:t>
+      </w:r>
+      <w:r>
+        <w:rPr>
+          <w:b/>
+          <w:bCs/>
+        </w:rPr>
+        <w:t xml:space="preserve">88%</w:t>
+      </w:r>
+      <w:r>
+        <w:t xml:space="preserve">.</w:t>
+      </w:r>
+    </w:p>
+    <w:p>
+      <w:pPr>
+        <w:pStyle w:val="BodyText"/>
+      </w:pPr>
+      <w:r>
+        <w:t xml:space="preserve">This is up from</w:t>
       </w:r>
       <w:r>
         <w:t xml:space="preserve"> </w:t>
@@ -282,63 +303,42 @@
         <w:t xml:space="preserve">83%</w:t>
       </w:r>
       <w:r>
-        <w:t xml:space="preserve">.</w:t>
-      </w:r>
-    </w:p>
-    <w:p>
-      <w:pPr>
-        <w:pStyle w:val="BodyText"/>
-      </w:pPr>
-      <w:r>
-        <w:t xml:space="preserve">This is up from</w:t>
-      </w:r>
-      <w:r>
         <w:t xml:space="preserve"> </w:t>
       </w:r>
       <w:r>
-        <w:rPr>
-          <w:b/>
-          <w:bCs/>
-        </w:rPr>
-        <w:t xml:space="preserve">75%</w:t>
-      </w:r>
-      <w:r>
-        <w:t xml:space="preserve"> </w:t>
-      </w:r>
-      <w:r>
-        <w:t xml:space="preserve">on 30 September. The two items that moved to Done are the cover date (</w:t>
-      </w:r>
-      <w:r>
-        <w:rPr>
-          <w:rStyle w:val="VerbatimChar"/>
-        </w:rPr>
-        <w:t xml:space="preserve">01</w:t>
-      </w:r>
-      <w:r>
-        <w:t xml:space="preserve"> </w:t>
-      </w:r>
-      <w:r>
-        <w:t xml:space="preserve">to</w:t>
-      </w:r>
-      <w:r>
-        <w:t xml:space="preserve"> </w:t>
-      </w:r>
-      <w:r>
-        <w:rPr>
-          <w:rStyle w:val="VerbatimChar"/>
-        </w:rPr>
-        <w:t xml:space="preserve">1</w:t>
-      </w:r>
-      <w:r>
-        <w:t xml:space="preserve">) and the prior-year HCE % / off-calendar 402(g) date rewrite.</w:t>
-      </w:r>
-    </w:p>
-    <w:p>
-      <w:pPr>
-        <w:pStyle w:val="BodyText"/>
-      </w:pPr>
-      <w:r>
-        <w:t xml:space="preserve">Items the application was not asked to replace (claiming the plan on the Testing Log, converting non-PDFs, and sending the live email) stay in the 24 so the percentage is the full reviewer job, not only the PDF editing.</w:t>
+        <w:t xml:space="preserve">on 1 October. Two items moved to Done:</w:t>
+      </w:r>
+    </w:p>
+    <w:p>
+      <w:pPr>
+        <w:pStyle w:val="Compact"/>
+        <w:numPr>
+          <w:ilvl w:val="0"/>
+          <w:numId w:val="1001"/>
+        </w:numPr>
+      </w:pPr>
+      <w:r>
+        <w:t xml:space="preserve">Inner pages of ADP/ACP, 410(b), and a component Average Benefit Percentage test are reordered when the page headings match.</w:t>
+      </w:r>
+    </w:p>
+    <w:p>
+      <w:pPr>
+        <w:pStyle w:val="Compact"/>
+        <w:numPr>
+          <w:ilvl w:val="0"/>
+          <w:numId w:val="1001"/>
+        </w:numPr>
+      </w:pPr>
+      <w:r>
+        <w:t xml:space="preserve">The Val Assembly Log is filled in the columns from the client log sheet (plan number, plan name, HCE, allocation, pass/fail, top heavy).</w:t>
+      </w:r>
+    </w:p>
+    <w:p>
+      <w:pPr>
+        <w:pStyle w:val="FirstParagraph"/>
+      </w:pPr>
+      <w:r>
+        <w:t xml:space="preserve">Claiming the plan on the Testing Log, converting non-PDFs, and sending the live email stay in the 24 so the percentage is the full reviewer job, not only the PDF editing.</w:t>
       </w:r>
     </w:p>
     <w:p>
@@ -438,7 +438,7 @@
               <w:pStyle w:val="Compact"/>
             </w:pPr>
             <w:r>
-              <w:t xml:space="preserve">Upload or folder path, merge, keyword order, named save</w:t>
+              <w:t xml:space="preserve">Upload or folder path, merge, keyword order, location order, named save</w:t>
             </w:r>
           </w:p>
         </w:tc>
@@ -473,7 +473,7 @@
               <w:pStyle w:val="Compact"/>
             </w:pPr>
             <w:r>
-              <w:t xml:space="preserve">Action Required, notices, letters, Excess Summary, recap, QNEC and refunds</w:t>
+              <w:t xml:space="preserve">Action Required, notices, letters, Excess Summary, recap, QNEC and refunds, BRF report left out, audited / SOC / 5500 / escalation wording removed</w:t>
             </w:r>
           </w:p>
         </w:tc>
@@ -508,7 +508,7 @@
               <w:pStyle w:val="Compact"/>
             </w:pPr>
             <w:r>
-              <w:t xml:space="preserve">Bookmarks, cover fields, and optional cover-day retype are done; “only Mutual of America” is still partly visual</w:t>
+              <w:t xml:space="preserve">Bookmarks, cover fields, and the cover-date check are done. “Only Mutual of America” is still partly visual</w:t>
             </w:r>
           </w:p>
         </w:tc>
@@ -543,7 +543,7 @@
               <w:pStyle w:val="Compact"/>
             </w:pPr>
             <w:r>
-              <w:t xml:space="preserve">Optional. The reviewer checks “Retype dates and HCE %”. Preview can highlight those spots. The download stays clean.</w:t>
+              <w:t xml:space="preserve">Optional. The reviewer checks “Retype cover date to today, 402(g) dates, and HCE %”. Preview can highlight those spots. The download stays clean</w:t>
             </w:r>
           </w:p>
         </w:tc>
@@ -567,18 +567,18 @@
               <w:pStyle w:val="Compact"/>
             </w:pPr>
             <w:r>
-              <w:t xml:space="preserve">50%</w:t>
-            </w:r>
-          </w:p>
-        </w:tc>
-        <w:tc>
-          <w:tcPr/>
-          <w:p>
-            <w:pPr>
-              <w:pStyle w:val="Compact"/>
-            </w:pPr>
-            <w:r>
-              <w:t xml:space="preserve">Draft and log row are written; send and “date sent” are still manual</w:t>
+              <w:t xml:space="preserve">75%</w:t>
+            </w:r>
+          </w:p>
+        </w:tc>
+        <w:tc>
+          <w:tcPr/>
+          <w:p>
+            <w:pPr>
+              <w:pStyle w:val="Compact"/>
+            </w:pPr>
+            <w:r>
+              <w:t xml:space="preserve">The log row is written in the client columns. The email is still a draft the reviewer sends</w:t>
             </w:r>
           </w:p>
         </w:tc>
@@ -602,18 +602,18 @@
               <w:pStyle w:val="Compact"/>
             </w:pPr>
             <w:r>
-              <w:t xml:space="preserve">17%</w:t>
-            </w:r>
-          </w:p>
-        </w:tc>
-        <w:tc>
-          <w:tcPr/>
-          <w:p>
-            <w:pPr>
-              <w:pStyle w:val="Compact"/>
-            </w:pPr>
-            <w:r>
-              <w:t xml:space="preserve">Inner test-page shuffle is partial. Testing Log and non-PDF conversion are not done.</w:t>
+              <w:t xml:space="preserve">33%</w:t>
+            </w:r>
+          </w:p>
+        </w:tc>
+        <w:tc>
+          <w:tcPr/>
+          <w:p>
+            <w:pPr>
+              <w:pStyle w:val="Compact"/>
+            </w:pPr>
+            <w:r>
+              <w:t xml:space="preserve">Inner test pages are ordered from headings. The Testing Log and non-PDF conversion are not done</w:t>
             </w:r>
           </w:p>
         </w:tc>
@@ -809,7 +809,7 @@
               <w:pStyle w:val="Compact"/>
             </w:pPr>
             <w:r>
-              <w:t xml:space="preserve">Put reports in the required order</w:t>
+              <w:t xml:space="preserve">Put reports in the required order, including location files (Loc 1, Loc 2)</w:t>
             </w:r>
           </w:p>
         </w:tc>
@@ -1370,7 +1370,7 @@
               <w:pStyle w:val="Compact"/>
             </w:pPr>
             <w:r>
-              <w:t xml:space="preserve">Bookmarks, including 403(b) HCE and ADP Test / ACP Test</w:t>
+              <w:t xml:space="preserve">Bookmarks, including 403(b) HCE and ADP Test / ACP Test. A BRF report is not bookmarked</w:t>
             </w:r>
           </w:p>
         </w:tc>
@@ -1508,29 +1508,29 @@
               <w:pStyle w:val="Compact"/>
             </w:pPr>
             <w:r>
-              <w:t xml:space="preserve">Reorder every inner 410(b) / benefit-test page</w:t>
-            </w:r>
-          </w:p>
-        </w:tc>
-        <w:tc>
-          <w:tcPr/>
-          <w:p>
-            <w:pPr>
-              <w:pStyle w:val="Compact"/>
-            </w:pPr>
-            <w:r>
-              <w:t xml:space="preserve">Partial</w:t>
-            </w:r>
-          </w:p>
-        </w:tc>
-        <w:tc>
-          <w:tcPr/>
-          <w:p>
-            <w:pPr>
-              <w:pStyle w:val="Compact"/>
-            </w:pPr>
-            <w:r>
-              <w:t xml:space="preserve">50</w:t>
+              <w:t xml:space="preserve">Reorder inner ADP/ACP, 410(b), and component benefit-test pages</w:t>
+            </w:r>
+          </w:p>
+        </w:tc>
+        <w:tc>
+          <w:tcPr/>
+          <w:p>
+            <w:pPr>
+              <w:pStyle w:val="Compact"/>
+            </w:pPr>
+            <w:r>
+              <w:t xml:space="preserve">Done</w:t>
+            </w:r>
+          </w:p>
+        </w:tc>
+        <w:tc>
+          <w:tcPr/>
+          <w:p>
+            <w:pPr>
+              <w:pStyle w:val="Compact"/>
+            </w:pPr>
+            <w:r>
+              <w:t xml:space="preserve">100</w:t>
             </w:r>
           </w:p>
         </w:tc>
@@ -1554,7 +1554,7 @@
               <w:pStyle w:val="Compact"/>
             </w:pPr>
             <w:r>
-              <w:t xml:space="preserve">Cover letter date shown as 1, not 01</w:t>
+              <w:t xml:space="preserve">Cover letter date is today’s date</w:t>
             </w:r>
           </w:p>
         </w:tc>
@@ -1646,29 +1646,29 @@
               <w:pStyle w:val="Compact"/>
             </w:pPr>
             <w:r>
-              <w:t xml:space="preserve">Update the Val Assembly Log</w:t>
-            </w:r>
-          </w:p>
-        </w:tc>
-        <w:tc>
-          <w:tcPr/>
-          <w:p>
-            <w:pPr>
-              <w:pStyle w:val="Compact"/>
-            </w:pPr>
-            <w:r>
-              <w:t xml:space="preserve">Partial</w:t>
-            </w:r>
-          </w:p>
-        </w:tc>
-        <w:tc>
-          <w:tcPr/>
-          <w:p>
-            <w:pPr>
-              <w:pStyle w:val="Compact"/>
-            </w:pPr>
-            <w:r>
-              <w:t xml:space="preserve">50</w:t>
+              <w:t xml:space="preserve">Update the Val Assembly Log in the client column sheet</w:t>
+            </w:r>
+          </w:p>
+        </w:tc>
+        <w:tc>
+          <w:tcPr/>
+          <w:p>
+            <w:pPr>
+              <w:pStyle w:val="Compact"/>
+            </w:pPr>
+            <w:r>
+              <w:t xml:space="preserve">Done</w:t>
+            </w:r>
+          </w:p>
+        </w:tc>
+        <w:tc>
+          <w:tcPr/>
+          <w:p>
+            <w:pPr>
+              <w:pStyle w:val="Compact"/>
+            </w:pPr>
+            <w:r>
+              <w:t xml:space="preserve">100</w:t>
             </w:r>
           </w:p>
         </w:tc>
@@ -1825,7 +1825,7 @@
         <w:pStyle w:val="Compact"/>
         <w:numPr>
           <w:ilvl w:val="0"/>
-          <w:numId w:val="1001"/>
+          <w:numId w:val="1002"/>
         </w:numPr>
       </w:pPr>
       <w:r>
@@ -1847,29 +1847,7 @@
         <w:pStyle w:val="Compact"/>
         <w:numPr>
           <w:ilvl w:val="0"/>
-          <w:numId w:val="1001"/>
-        </w:numPr>
-      </w:pPr>
-      <w:r>
-        <w:rPr>
-          <w:b/>
-          <w:bCs/>
-        </w:rPr>
-        <w:t xml:space="preserve">Inner test pages:</w:t>
-      </w:r>
-      <w:r>
-        <w:t xml:space="preserve"> </w:t>
-      </w:r>
-      <w:r>
-        <w:t xml:space="preserve">whole reports are ordered. Detail pages inside 410(b) or Average Benefit Percentage are not split the way Adobe thumbnails would.</w:t>
-      </w:r>
-    </w:p>
-    <w:p>
-      <w:pPr>
-        <w:pStyle w:val="Compact"/>
-        <w:numPr>
-          <w:ilvl w:val="0"/>
-          <w:numId w:val="1001"/>
+          <w:numId w:val="1002"/>
         </w:numPr>
       </w:pPr>
       <w:r>
@@ -1888,10 +1866,18 @@
     </w:p>
     <w:p>
       <w:pPr>
+        <w:pStyle w:val="FirstParagraph"/>
+      </w:pPr>
+      <w:r>
+        <w:t xml:space="preserve">Done since the last report:</w:t>
+      </w:r>
+    </w:p>
+    <w:p>
+      <w:pPr>
         <w:pStyle w:val="Compact"/>
         <w:numPr>
           <w:ilvl w:val="0"/>
-          <w:numId w:val="1001"/>
+          <w:numId w:val="1003"/>
         </w:numPr>
       </w:pPr>
       <w:r>
@@ -1899,21 +1885,13 @@
           <w:b/>
           <w:bCs/>
         </w:rPr>
-        <w:t xml:space="preserve">Assembly log:</w:t>
+        <w:t xml:space="preserve">Inner pages.</w:t>
       </w:r>
       <w:r>
         <w:t xml:space="preserve"> </w:t>
       </w:r>
       <w:r>
-        <w:t xml:space="preserve">Date, Time, plan, year, and file name are written when Process is clicked. Time is assembly time, not “date sent”.</w:t>
-      </w:r>
-    </w:p>
-    <w:p>
-      <w:pPr>
-        <w:pStyle w:val="FirstParagraph"/>
-      </w:pPr>
-      <w:r>
-        <w:t xml:space="preserve">Done, and turned on by the reviewer:</w:t>
+        <w:t xml:space="preserve">When the headings are on the page, ADP/ACP is ordered Summary, Detail, Excluded, Corrections. 410(b) is ordered Detail, Excludable, Includable, Summary. A component Average Benefit Percentage test is ordered Average Benefit Percentage, 401a1 Comp, Gateway, Overall Comp, Rate Group, then Sum Comp.</w:t>
       </w:r>
     </w:p>
     <w:p>
@@ -1921,7 +1899,7 @@
         <w:pStyle w:val="Compact"/>
         <w:numPr>
           <w:ilvl w:val="0"/>
-          <w:numId w:val="1002"/>
+          <w:numId w:val="1003"/>
         </w:numPr>
       </w:pPr>
       <w:r>
@@ -1929,29 +1907,35 @@
           <w:b/>
           <w:bCs/>
         </w:rPr>
-        <w:t xml:space="preserve">Cover date, prior-year HCE %, and off-calendar 402(g) dates.</w:t>
+        <w:t xml:space="preserve">BRF.</w:t>
       </w:r>
       <w:r>
         <w:t xml:space="preserve"> </w:t>
       </w:r>
       <w:r>
-        <w:t xml:space="preserve">These stay as printed unless the reviewer checks</w:t>
-      </w:r>
-      <w:r>
-        <w:t xml:space="preserve"> </w:t>
-      </w:r>
+        <w:t xml:space="preserve">A BRF report file or page is left out. The Result Summary line stays. BRF is not bookmarked.</w:t>
+      </w:r>
+    </w:p>
+    <w:p>
+      <w:pPr>
+        <w:pStyle w:val="Compact"/>
+        <w:numPr>
+          <w:ilvl w:val="0"/>
+          <w:numId w:val="1003"/>
+        </w:numPr>
+      </w:pPr>
       <w:r>
         <w:rPr>
           <w:b/>
           <w:bCs/>
         </w:rPr>
-        <w:t xml:space="preserve">Retype dates and HCE %</w:t>
+        <w:t xml:space="preserve">Wording MOA packages do not use.</w:t>
       </w:r>
       <w:r>
         <w:t xml:space="preserve"> </w:t>
       </w:r>
       <w:r>
-        <w:t xml:space="preserve">before Process. The box is off by default so a normal run does not move text on the page.</w:t>
+        <w:t xml:space="preserve">Audited wording, Statement of Contribution, 5500 wording, and escalation wording are removed.</w:t>
       </w:r>
     </w:p>
     <w:p>
@@ -1959,35 +1943,21 @@
         <w:pStyle w:val="Compact"/>
         <w:numPr>
           <w:ilvl w:val="0"/>
-          <w:numId w:val="1002"/>
+          <w:numId w:val="1003"/>
         </w:numPr>
       </w:pPr>
       <w:r>
-        <w:t xml:space="preserve">A cover day changes only when the cover shows a zero-padded day (</w:t>
-      </w:r>
-      <w:r>
         <w:rPr>
-          <w:rStyle w:val="VerbatimChar"/>
+          <w:b/>
+          <w:bCs/>
         </w:rPr>
-        <w:t xml:space="preserve">January 01</w:t>
+        <w:t xml:space="preserve">Valuation package log Excel.</w:t>
       </w:r>
       <w:r>
         <w:t xml:space="preserve"> </w:t>
       </w:r>
       <w:r>
-        <w:t xml:space="preserve">becomes</w:t>
-      </w:r>
-      <w:r>
-        <w:t xml:space="preserve"> </w:t>
-      </w:r>
-      <w:r>
-        <w:rPr>
-          <w:rStyle w:val="VerbatimChar"/>
-        </w:rPr>
-        <w:t xml:space="preserve">January 1</w:t>
-      </w:r>
-      <w:r>
-        <w:t xml:space="preserve">).</w:t>
+        <w:t xml:space="preserve">PRIOR YEAR / CURRENT YEAR sets the testing method. Future HCE, current HCE, and the allocation answer are read. Annual allocation Yes, or a note that says include contributions, keeps the contributions wording.</w:t>
       </w:r>
     </w:p>
     <w:p>
@@ -1995,11 +1965,37 @@
         <w:pStyle w:val="Compact"/>
         <w:numPr>
           <w:ilvl w:val="0"/>
-          <w:numId w:val="1002"/>
+          <w:numId w:val="1003"/>
         </w:numPr>
       </w:pPr>
       <w:r>
-        <w:t xml:space="preserve">The HCE percentage is calculated only when the testing method is PRIOR and an NHCE % is on the package (under 2% → ×2; 2% to 7.99% → +2; 8% or more → ×1.25).</w:t>
+        <w:rPr>
+          <w:b/>
+          <w:bCs/>
+        </w:rPr>
+        <w:t xml:space="preserve">Cover date.</w:t>
+      </w:r>
+      <w:r>
+        <w:t xml:space="preserve"> </w:t>
+      </w:r>
+      <w:r>
+        <w:t xml:space="preserve">With</w:t>
+      </w:r>
+      <w:r>
+        <w:t xml:space="preserve"> </w:t>
+      </w:r>
+      <w:r>
+        <w:rPr>
+          <w:b/>
+          <w:bCs/>
+        </w:rPr>
+        <w:t xml:space="preserve">Retype cover date to today, 402(g) dates, and HCE %</w:t>
+      </w:r>
+      <w:r>
+        <w:t xml:space="preserve"> </w:t>
+      </w:r>
+      <w:r>
+        <w:t xml:space="preserve">checked, the cover letter date is set to today. The box is off by default. The Checks tab flags a cover date that is not today.</w:t>
       </w:r>
     </w:p>
     <w:p>
@@ -2007,11 +2003,21 @@
         <w:pStyle w:val="Compact"/>
         <w:numPr>
           <w:ilvl w:val="0"/>
-          <w:numId w:val="1002"/>
+          <w:numId w:val="1003"/>
         </w:numPr>
       </w:pPr>
       <w:r>
-        <w:t xml:space="preserve">402(g) dates change only on an off-calendar plan, and only when those plan-year dates are printed on a 402(g) page. A calendar plan (year ending 31 December) is left as printed.</w:t>
+        <w:rPr>
+          <w:b/>
+          <w:bCs/>
+        </w:rPr>
+        <w:t xml:space="preserve">Prior-year HCE %</w:t>
+      </w:r>
+      <w:r>
+        <w:t xml:space="preserve"> </w:t>
+      </w:r>
+      <w:r>
+        <w:t xml:space="preserve">still uses the table (under 2% → ×2; 2% to 7.99% → +2; 8% or more → ×1.25), and only when the testing method is PRIOR and an NHCE % is on the package.</w:t>
       </w:r>
     </w:p>
     <w:p>
@@ -2019,7 +2025,29 @@
         <w:pStyle w:val="Compact"/>
         <w:numPr>
           <w:ilvl w:val="0"/>
-          <w:numId w:val="1002"/>
+          <w:numId w:val="1003"/>
+        </w:numPr>
+      </w:pPr>
+      <w:r>
+        <w:rPr>
+          <w:b/>
+          <w:bCs/>
+        </w:rPr>
+        <w:t xml:space="preserve">402(g) dates</w:t>
+      </w:r>
+      <w:r>
+        <w:t xml:space="preserve"> </w:t>
+      </w:r>
+      <w:r>
+        <w:t xml:space="preserve">still change only on an off-calendar plan, and only when those plan-year dates are printed on a 402(g) page.</w:t>
+      </w:r>
+    </w:p>
+    <w:p>
+      <w:pPr>
+        <w:pStyle w:val="Compact"/>
+        <w:numPr>
+          <w:ilvl w:val="0"/>
+          <w:numId w:val="1003"/>
         </w:numPr>
       </w:pPr>
       <w:r>
@@ -2033,15 +2061,7 @@
         <w:t xml:space="preserve"> </w:t>
       </w:r>
       <w:r>
-        <w:t xml:space="preserve">on the preview is also optional and checked by default. Yellow marks show the rewritten words. Uncheck it for a plain preview. Download PDF never includes the marks.</w:t>
-      </w:r>
-    </w:p>
-    <w:p>
-      <w:pPr>
-        <w:pStyle w:val="FirstParagraph"/>
-      </w:pPr>
-      <w:r>
-        <w:t xml:space="preserve">Not done, and not planned as PDF automation:</w:t>
+        <w:t xml:space="preserve">on the preview stays optional. Yellow marks show the rewritten words. Download PDF never includes the marks.</w:t>
       </w:r>
     </w:p>
     <w:p>
@@ -2053,7 +2073,17 @@
         </w:numPr>
       </w:pPr>
       <w:r>
-        <w:t xml:space="preserve">Entering the reviewer’s name on the Testing Log.</w:t>
+        <w:rPr>
+          <w:b/>
+          <w:bCs/>
+        </w:rPr>
+        <w:t xml:space="preserve">Checks.</w:t>
+      </w:r>
+      <w:r>
+        <w:t xml:space="preserve"> </w:t>
+      </w:r>
+      <w:r>
+        <w:t xml:space="preserve">Result Summary top-heavy percent (including 0.00% and Plan is / is not Top Heavy) and pass/fail for 410(b), 401(a)(4), 414(s), 402(g), 415, ADP, and ACP. A failed 410(b) also looks for the Average Benefit Percentage wording. The three Compliance and Administrative Report pages are flagged if they are missing; they are not created. The client variance copy is checked for plan identity, Social Security numbers, 0.00 zeroes, one font size, Last-First name order, and text at the page edge. Plan number and plan name are checked on each report, and plan year end on the excess notice.</w:t>
       </w:r>
     </w:p>
     <w:p>
@@ -2065,24 +2095,25 @@
         </w:numPr>
       </w:pPr>
       <w:r>
-        <w:t xml:space="preserve">Converting Word or Excel into PDF (those files are skipped with a warning).</w:t>
-      </w:r>
-    </w:p>
-    <w:p>
-      <w:r>
-        <w:pict>
-          <v:rect style="width:0;height:1.5pt" o:hralign="center" o:hrstd="t" o:hr="t"/>
-        </w:pict>
-      </w:r>
-    </w:p>
-    <w:bookmarkEnd w:id="11"/>
-    <w:bookmarkStart w:id="12" w:name="what-is-ready-to-show"/>
-    <w:p>
-      <w:pPr>
-        <w:pStyle w:val="Heading2"/>
-      </w:pPr>
-      <w:r>
-        <w:t xml:space="preserve">What is ready to show</w:t>
+        <w:rPr>
+          <w:b/>
+          <w:bCs/>
+        </w:rPr>
+        <w:t xml:space="preserve">Val Assembly Log.</w:t>
+      </w:r>
+      <w:r>
+        <w:t xml:space="preserve"> </w:t>
+      </w:r>
+      <w:r>
+        <w:t xml:space="preserve">One row is appended in the client columns: Omni Plan Number and Plan Name from the Result Summary; Future HCE and current-year HCE as Yes or No; allocation as Variance, Annual, or Annual-Var (a true-up with no variance is Variance, with a cell note of 0.00 variance); ADP/ACP, 402(g), 410(b), ABP, 414(s), 401(a)(4), 415, and BRF as P, F, or N/A; Top Heavy as Yes or No; Failed Comp Limit always N/A. FIS, related plans, MEP, and safe harbor are left blank for the tester.</w:t>
+      </w:r>
+    </w:p>
+    <w:p>
+      <w:pPr>
+        <w:pStyle w:val="FirstParagraph"/>
+      </w:pPr>
+      <w:r>
+        <w:t xml:space="preserve">Not done:</w:t>
       </w:r>
     </w:p>
     <w:p>
@@ -2094,7 +2125,17 @@
         </w:numPr>
       </w:pPr>
       <w:r>
-        <w:t xml:space="preserve">Upload PDFs or a Valuation Package folder path.</w:t>
+        <w:rPr>
+          <w:b/>
+          <w:bCs/>
+        </w:rPr>
+        <w:t xml:space="preserve">Claiming the plan on the Testing Log.</w:t>
+      </w:r>
+      <w:r>
+        <w:t xml:space="preserve"> </w:t>
+      </w:r>
+      <w:r>
+        <w:t xml:space="preserve">This is the shared workbook a reviewer opens before assembly and types their name into, so other people can see that plan is already being worked. The requirements point at files such as the 2023 testing log and the off-calendar testing log, on the assembly tab under the testing folders. The application does not open those shared workbooks. It does not know which year’s log or which row is the plan being picked up, and it does not have the reviewer’s name to write into that sheet. The Val Assembly Log that Process writes is a separate file. That one records the finished package. Filling it does not claim the plan.</w:t>
       </w:r>
     </w:p>
     <w:p>
@@ -2106,96 +2147,159 @@
         </w:numPr>
       </w:pPr>
       <w:r>
-        <w:t xml:space="preserve">Auto-order and a reorder list.</w:t>
-      </w:r>
-    </w:p>
-    <w:p>
-      <w:pPr>
-        <w:pStyle w:val="Compact"/>
-        <w:numPr>
-          <w:ilvl w:val="0"/>
-          <w:numId w:val="1004"/>
-        </w:numPr>
-      </w:pPr>
-      <w:r>
-        <w:t xml:space="preserve">Process: keep/remove, filled amounts, bookmarks.</w:t>
-      </w:r>
-    </w:p>
-    <w:p>
-      <w:pPr>
-        <w:pStyle w:val="Compact"/>
-        <w:numPr>
-          <w:ilvl w:val="0"/>
-          <w:numId w:val="1004"/>
-        </w:numPr>
-      </w:pPr>
-      <w:r>
-        <w:t xml:space="preserve">Optional retype of the cover day, the prior-year HCE %, and off-calendar 402(g) dates.</w:t>
-      </w:r>
-    </w:p>
-    <w:p>
-      <w:pPr>
-        <w:pStyle w:val="Compact"/>
-        <w:numPr>
-          <w:ilvl w:val="0"/>
-          <w:numId w:val="1004"/>
-        </w:numPr>
-      </w:pPr>
-      <w:r>
-        <w:t xml:space="preserve">Preview with optional highlights on the rewritten words, and a download of the named valuation PDF without those highlights.</w:t>
-      </w:r>
-    </w:p>
-    <w:p>
-      <w:pPr>
-        <w:pStyle w:val="Compact"/>
-        <w:numPr>
-          <w:ilvl w:val="0"/>
-          <w:numId w:val="1004"/>
-        </w:numPr>
-      </w:pPr>
-      <w:r>
-        <w:t xml:space="preserve">Outlook draft and an assembly-log row.</w:t>
-      </w:r>
-    </w:p>
-    <w:p>
-      <w:r>
-        <w:pict>
-          <v:rect style="width:0;height:1.5pt" o:hralign="center" o:hrstd="t" o:hr="t"/>
-        </w:pict>
-      </w:r>
-    </w:p>
-    <w:bookmarkEnd w:id="12"/>
-    <w:bookmarkStart w:id="13" w:name="what-to-say-if-asked-is-it-finished"/>
-    <w:p>
-      <w:pPr>
-        <w:pStyle w:val="Heading2"/>
-      </w:pPr>
-      <w:r>
-        <w:t xml:space="preserve">What to say if asked “is it finished?”</w:t>
-      </w:r>
-    </w:p>
-    <w:p>
-      <w:pPr>
-        <w:pStyle w:val="FirstParagraph"/>
-      </w:pPr>
-      <w:r>
-        <w:t xml:space="preserve">The application covers the manual PDF assembly and review rules at about</w:t>
-      </w:r>
-      <w:r>
-        <w:t xml:space="preserve"> </w:t>
-      </w:r>
-      <w:r>
         <w:rPr>
           <w:b/>
           <w:bCs/>
         </w:rPr>
-        <w:t xml:space="preserve">95%</w:t>
+        <w:t xml:space="preserve">Converting Word, Excel, or image files into PDF.</w:t>
       </w:r>
       <w:r>
         <w:t xml:space="preserve"> </w:t>
       </w:r>
       <w:r>
-        <w:t xml:space="preserve">of those editing steps (18 of 20 PDF items are done; two are partial).</w:t>
+        <w:t xml:space="preserve">Those files are skipped with a warning. Scanned PDFs that are only pictures also cannot be read, so rules, bookmarks, the filename, and the log stay empty on those packages.</w:t>
+      </w:r>
+    </w:p>
+    <w:p>
+      <w:r>
+        <w:pict>
+          <v:rect style="width:0;height:1.5pt" o:hralign="center" o:hrstd="t" o:hr="t"/>
+        </w:pict>
+      </w:r>
+    </w:p>
+    <w:bookmarkEnd w:id="11"/>
+    <w:bookmarkStart w:id="12" w:name="what-is-ready-to-show"/>
+    <w:p>
+      <w:pPr>
+        <w:pStyle w:val="Heading2"/>
+      </w:pPr>
+      <w:r>
+        <w:t xml:space="preserve">What is ready to show</w:t>
+      </w:r>
+    </w:p>
+    <w:p>
+      <w:pPr>
+        <w:pStyle w:val="Compact"/>
+        <w:numPr>
+          <w:ilvl w:val="0"/>
+          <w:numId w:val="1005"/>
+        </w:numPr>
+      </w:pPr>
+      <w:r>
+        <w:t xml:space="preserve">Upload PDFs or a Valuation Package folder path.</w:t>
+      </w:r>
+    </w:p>
+    <w:p>
+      <w:pPr>
+        <w:pStyle w:val="Compact"/>
+        <w:numPr>
+          <w:ilvl w:val="0"/>
+          <w:numId w:val="1005"/>
+        </w:numPr>
+      </w:pPr>
+      <w:r>
+        <w:t xml:space="preserve">Auto-order, location order, and a reorder list.</w:t>
+      </w:r>
+    </w:p>
+    <w:p>
+      <w:pPr>
+        <w:pStyle w:val="Compact"/>
+        <w:numPr>
+          <w:ilvl w:val="0"/>
+          <w:numId w:val="1005"/>
+        </w:numPr>
+      </w:pPr>
+      <w:r>
+        <w:t xml:space="preserve">Process: keep/remove, filled amounts, bookmarks, BRF report left out, disallowed wording removed.</w:t>
+      </w:r>
+    </w:p>
+    <w:p>
+      <w:pPr>
+        <w:pStyle w:val="Compact"/>
+        <w:numPr>
+          <w:ilvl w:val="0"/>
+          <w:numId w:val="1005"/>
+        </w:numPr>
+      </w:pPr>
+      <w:r>
+        <w:t xml:space="preserve">Optional retype of the cover date to today, the prior-year HCE %, and off-calendar 402(g) dates.</w:t>
+      </w:r>
+    </w:p>
+    <w:p>
+      <w:pPr>
+        <w:pStyle w:val="Compact"/>
+        <w:numPr>
+          <w:ilvl w:val="0"/>
+          <w:numId w:val="1005"/>
+        </w:numPr>
+      </w:pPr>
+      <w:r>
+        <w:t xml:space="preserve">Preview with optional highlights on the rewritten words, and a download of the named valuation PDF without those highlights.</w:t>
+      </w:r>
+    </w:p>
+    <w:p>
+      <w:pPr>
+        <w:pStyle w:val="Compact"/>
+        <w:numPr>
+          <w:ilvl w:val="0"/>
+          <w:numId w:val="1005"/>
+        </w:numPr>
+      </w:pPr>
+      <w:r>
+        <w:t xml:space="preserve">Checks for the Result Summary, the three compliance pages, the client variance copy, and plan identity on the reports.</w:t>
+      </w:r>
+    </w:p>
+    <w:p>
+      <w:pPr>
+        <w:pStyle w:val="Compact"/>
+        <w:numPr>
+          <w:ilvl w:val="0"/>
+          <w:numId w:val="1005"/>
+        </w:numPr>
+      </w:pPr>
+      <w:r>
+        <w:t xml:space="preserve">Outlook draft and an assembly-log row in the client columns.</w:t>
+      </w:r>
+    </w:p>
+    <w:p>
+      <w:r>
+        <w:pict>
+          <v:rect style="width:0;height:1.5pt" o:hralign="center" o:hrstd="t" o:hr="t"/>
+        </w:pict>
+      </w:r>
+    </w:p>
+    <w:bookmarkEnd w:id="12"/>
+    <w:bookmarkStart w:id="13" w:name="what-to-say-if-asked-is-it-finished"/>
+    <w:p>
+      <w:pPr>
+        <w:pStyle w:val="Heading2"/>
+      </w:pPr>
+      <w:r>
+        <w:t xml:space="preserve">What to say if asked “is it finished?”</w:t>
+      </w:r>
+    </w:p>
+    <w:p>
+      <w:pPr>
+        <w:pStyle w:val="FirstParagraph"/>
+      </w:pPr>
+      <w:r>
+        <w:t xml:space="preserve">The application covers the manual PDF assembly and review rules at about</w:t>
+      </w:r>
+      <w:r>
+        <w:t xml:space="preserve"> </w:t>
+      </w:r>
+      <w:r>
+        <w:rPr>
+          <w:b/>
+          <w:bCs/>
+        </w:rPr>
+        <w:t xml:space="preserve">98%</w:t>
+      </w:r>
+      <w:r>
+        <w:t xml:space="preserve"> </w:t>
+      </w:r>
+      <w:r>
+        <w:t xml:space="preserve">of those editing steps (19 of 20 PDF items are done; one is partial).</w:t>
       </w:r>
       <w:r>
         <w:br/>
@@ -2227,13 +2331,13 @@
           <w:b/>
           <w:bCs/>
         </w:rPr>
-        <w:t xml:space="preserve">83%</w:t>
+        <w:t xml:space="preserve">88%</w:t>
       </w:r>
       <w:r>
         <w:t xml:space="preserve"> </w:t>
       </w:r>
       <w:r>
-        <w:t xml:space="preserve">(was 75% before the date and HCE % option).</w:t>
+        <w:t xml:space="preserve">(was 83% on 1 October).</w:t>
       </w:r>
     </w:p>
     <w:p>
@@ -2241,7 +2345,7 @@
         <w:pStyle w:val="BodyText"/>
       </w:pPr>
       <w:r>
-        <w:t xml:space="preserve">The remaining work is reviewer action outside the PDF: sending the email, the Testing Log, and converting non-PDF files. A package with no matching date or percentage will look unchanged even with the retype box checked; the notes on the result say what was left as printed.</w:t>
+        <w:t xml:space="preserve">The remaining work is a visual check for other company names on the cover, sending the email, claiming the plan on the Testing Log, and converting non-PDF files. A package with no matching date or percentage will look unchanged even with the retype box checked; the notes on the result say what was left as printed.</w:t>
       </w:r>
     </w:p>
     <w:bookmarkEnd w:id="13"/>
@@ -2472,6 +2576,9 @@
     <w:abstractNumId w:val="991"/>
   </w:num>
   <w:num w:numId="1004">
+    <w:abstractNumId w:val="991"/>
+  </w:num>
+  <w:num w:numId="1005">
     <w:abstractNumId w:val="991"/>
   </w:num>
 </w:numbering>

</xml_diff>